<commit_message>
fix(project): wrap email addresses in the report table
</commit_message>
<xml_diff>
--- a/public/group-project/report-template.docx
+++ b/public/group-project/report-template.docx
@@ -167,7 +167,7 @@
               <w:pStyle w:val="TableText"/>
             </w:pPr>
             <w:r>
-              <w:t xml:space="preserve">[HKU email]</w:t>
+              <w:t xml:space="preserve">[HKU-email]</w:t>
             </w:r>
           </w:p>
         </w:tc>
@@ -237,7 +237,7 @@
               <w:pStyle w:val="TableText"/>
             </w:pPr>
             <w:r>
-              <w:t xml:space="preserve">[HKU email]</w:t>
+              <w:t xml:space="preserve">[HKU-email]</w:t>
             </w:r>
           </w:p>
         </w:tc>
@@ -307,7 +307,7 @@
               <w:pStyle w:val="TableText"/>
             </w:pPr>
             <w:r>
-              <w:t xml:space="preserve">[HKU email]</w:t>
+              <w:t xml:space="preserve">[HKU-email]</w:t>
             </w:r>
           </w:p>
         </w:tc>
@@ -377,7 +377,7 @@
               <w:pStyle w:val="TableText"/>
             </w:pPr>
             <w:r>
-              <w:t xml:space="preserve">[HKU email]</w:t>
+              <w:t xml:space="preserve">[HKU-email]</w:t>
             </w:r>
           </w:p>
         </w:tc>
@@ -447,7 +447,7 @@
               <w:pStyle w:val="TableText"/>
             </w:pPr>
             <w:r>
-              <w:t xml:space="preserve">[HKU email]</w:t>
+              <w:t xml:space="preserve">[HKU-email]</w:t>
             </w:r>
           </w:p>
         </w:tc>

</xml_diff>

<commit_message>
docs(project): expand report structure and clarify submissions
</commit_message>
<xml_diff>
--- a/public/group-project/report-template.docx
+++ b/public/group-project/report-template.docx
@@ -5,6 +5,8 @@
     <w:p>
       <w:pPr>
         <w:pStyle w:val="Title"/>
+        <w:keepNext/>
+        <w:keepLines/>
       </w:pPr>
       <w:r>
         <w:t xml:space="preserve">[Project Title]</w:t>
@@ -23,6 +25,8 @@
     <w:p>
       <w:pPr>
         <w:pStyle w:val="Heading1"/>
+        <w:keepNext/>
+        <w:keepLines/>
       </w:pPr>
       <w:r>
         <w:t xml:space="preserve">Group Members and Contributions</w:t>
@@ -552,6 +556,8 @@
     <w:p>
       <w:pPr>
         <w:pStyle w:val="Heading1"/>
+        <w:keepNext/>
+        <w:keepLines/>
       </w:pPr>
       <w:r>
         <w:t xml:space="preserve">1. Introduction</w:t>
@@ -559,72 +565,252 @@
     </w:p>
     <w:p>
       <w:r>
-        <w:t xml:space="preserve">State the prediction problem and project objectives.</w:t>
+        <w:t xml:space="preserve">Introduce the motivation, project objectives and main contributions.</w:t>
       </w:r>
     </w:p>
     <w:p>
       <w:pPr>
         <w:pStyle w:val="Heading1"/>
-      </w:pPr>
-      <w:r>
-        <w:t xml:space="preserve">2. Data and Preprocessing</w:t>
-      </w:r>
-    </w:p>
-    <w:p>
-      <w:r>
-        <w:t xml:space="preserve">Describe the data, preprocessing and feature engineering.</w:t>
+        <w:keepNext/>
+        <w:keepLines/>
+      </w:pPr>
+      <w:r>
+        <w:t xml:space="preserve">2. Related Work</w:t>
+      </w:r>
+    </w:p>
+    <w:p>
+      <w:r>
+        <w:t xml:space="preserve">Discuss relevant studies and approaches, with citations.</w:t>
       </w:r>
     </w:p>
     <w:p>
       <w:pPr>
         <w:pStyle w:val="Heading1"/>
-      </w:pPr>
-      <w:r>
-        <w:t xml:space="preserve">3. Methods and Validation</w:t>
-      </w:r>
-    </w:p>
-    <w:p>
-      <w:r>
-        <w:t xml:space="preserve">Explain the baseline, candidate models, validation design and tuning.</w:t>
+        <w:keepNext/>
+        <w:keepLines/>
+      </w:pPr>
+      <w:r>
+        <w:t xml:space="preserve">3. Methodology</w:t>
+      </w:r>
+    </w:p>
+    <w:p>
+      <w:r>
+        <w:t xml:space="preserve">Present your overall pipeline and explain your approach.</w:t>
+      </w:r>
+    </w:p>
+    <w:tbl>
+      <w:tblPr>
+        <w:tblW w:w="9072" w:type="dxa"/>
+        <w:tblBorders>
+          <w:top w:val="single" w:sz="4" w:color="000000"/>
+          <w:left w:val="single" w:sz="4" w:color="000000"/>
+          <w:bottom w:val="single" w:sz="4" w:color="000000"/>
+          <w:right w:val="single" w:sz="4" w:color="000000"/>
+        </w:tblBorders>
+      </w:tblPr>
+      <w:tblGrid>
+        <w:gridCol w:w="9072"/>
+      </w:tblGrid>
+      <w:tr>
+        <w:trPr>
+          <w:cantSplit/>
+          <w:trHeight w:val="1701" w:hRule="atLeast"/>
+        </w:trPr>
+        <w:tc>
+          <w:tcPr>
+            <w:tcW w:w="9072" w:type="dxa"/>
+            <w:vAlign w:val="center"/>
+          </w:tcPr>
+          <w:p>
+            <w:pPr>
+              <w:pStyle w:val="FigurePlaceholder"/>
+            </w:pPr>
+            <w:r>
+              <w:t xml:space="preserve">Overall pipeline figure</w:t>
+            </w:r>
+          </w:p>
+          <w:p>
+            <w:pPr>
+              <w:pStyle w:val="FigurePlaceholder"/>
+            </w:pPr>
+            <w:r>
+              <w:t xml:space="preserve">Show the flow from data and preprocessing to modelling and predictions.</w:t>
+            </w:r>
+          </w:p>
+        </w:tc>
+      </w:tr>
+    </w:tbl>
+    <w:p>
+      <w:pPr>
+        <w:pStyle w:val="Caption"/>
+      </w:pPr>
+      <w:r>
+        <w:t xml:space="preserve">Figure 1. Overall pipeline (replace the placeholder with your figure).</w:t>
+      </w:r>
+    </w:p>
+    <w:p>
+      <w:pPr>
+        <w:pStyle w:val="Heading2"/>
+        <w:keepNext/>
+        <w:keepLines/>
+      </w:pPr>
+      <w:r>
+        <w:t xml:space="preserve">3.1 Problem Formulation</w:t>
+      </w:r>
+    </w:p>
+    <w:p>
+      <w:r>
+        <w:t xml:space="preserve">Define the inputs, prediction target, notation and learning objective.</w:t>
+      </w:r>
+    </w:p>
+    <w:p>
+      <w:pPr>
+        <w:pStyle w:val="Heading2"/>
+        <w:keepNext/>
+        <w:keepLines/>
+      </w:pPr>
+      <w:r>
+        <w:t xml:space="preserve">3.2 Method Design</w:t>
+      </w:r>
+    </w:p>
+    <w:p>
+      <w:r>
+        <w:t xml:space="preserve">Describe preprocessing, feature engineering and your model or algorithm design.</w:t>
       </w:r>
     </w:p>
     <w:p>
       <w:pPr>
         <w:pStyle w:val="Heading1"/>
-      </w:pPr>
-      <w:r>
-        <w:t xml:space="preserve">4. Results and Model Analysis</w:t>
-      </w:r>
-    </w:p>
-    <w:p>
-      <w:r>
-        <w:t xml:space="preserve">Compare results and analyse model behaviour with tables or figures.</w:t>
+        <w:keepNext/>
+        <w:keepLines/>
+      </w:pPr>
+      <w:r>
+        <w:t xml:space="preserve">4. Experimental Setups</w:t>
+      </w:r>
+    </w:p>
+    <w:p>
+      <w:r>
+        <w:t xml:space="preserve">Describe the experimental protocol used for all comparisons.</w:t>
+      </w:r>
+    </w:p>
+    <w:p>
+      <w:pPr>
+        <w:pStyle w:val="Heading2"/>
+        <w:keepNext/>
+        <w:keepLines/>
+      </w:pPr>
+      <w:r>
+        <w:t xml:space="preserve">4.1 Datasets, Tasks, and Evaluation</w:t>
+      </w:r>
+    </w:p>
+    <w:p>
+      <w:r>
+        <w:t xml:space="preserve">Describe the supplied datasets, prediction task, validation splits, leakage prevention and evaluation metrics.</w:t>
+      </w:r>
+    </w:p>
+    <w:p>
+      <w:pPr>
+        <w:pStyle w:val="Heading2"/>
+        <w:keepNext/>
+        <w:keepLines/>
+      </w:pPr>
+      <w:r>
+        <w:t xml:space="preserve">4.2 Baseline Methods</w:t>
+      </w:r>
+    </w:p>
+    <w:p>
+      <w:r>
+        <w:t xml:space="preserve">Describe the reference methods and how you compare them fairly.</w:t>
+      </w:r>
+    </w:p>
+    <w:p>
+      <w:pPr>
+        <w:pStyle w:val="Heading2"/>
+        <w:keepNext/>
+        <w:keepLines/>
+      </w:pPr>
+      <w:r>
+        <w:t xml:space="preserve">4.3 Implementation Details</w:t>
+      </w:r>
+    </w:p>
+    <w:p>
+      <w:r>
+        <w:t xml:space="preserve">Report model hyperparameters, tuning procedure, random seeds, hardware and software configuration.</w:t>
       </w:r>
     </w:p>
     <w:p>
       <w:pPr>
         <w:pStyle w:val="Heading1"/>
-      </w:pPr>
-      <w:r>
-        <w:t xml:space="preserve">5. Discussion and Conclusion</w:t>
-      </w:r>
-    </w:p>
-    <w:p>
-      <w:r>
-        <w:t xml:space="preserve">Summarise findings, limitations and conclusions.</w:t>
+        <w:keepNext/>
+        <w:keepLines/>
+      </w:pPr>
+      <w:r>
+        <w:t xml:space="preserve">5. Experimental Results and Analysis</w:t>
+      </w:r>
+    </w:p>
+    <w:p>
+      <w:r>
+        <w:t xml:space="preserve">Present quantitative comparisons and analyse model behaviour, errors and ablations with tables or figures.</w:t>
       </w:r>
     </w:p>
     <w:p>
       <w:pPr>
         <w:pStyle w:val="Heading1"/>
-      </w:pPr>
-      <w:r>
-        <w:t xml:space="preserve">6. References</w:t>
+        <w:keepNext/>
+        <w:keepLines/>
+      </w:pPr>
+      <w:r>
+        <w:t xml:space="preserve">6. Discussion</w:t>
+      </w:r>
+    </w:p>
+    <w:p>
+      <w:r>
+        <w:t xml:space="preserve">Discuss the implications, limitations and potential improvements.</w:t>
+      </w:r>
+    </w:p>
+    <w:p>
+      <w:pPr>
+        <w:pStyle w:val="Heading1"/>
+        <w:keepNext/>
+        <w:keepLines/>
+      </w:pPr>
+      <w:r>
+        <w:t xml:space="preserve">7. Conclusion</w:t>
+      </w:r>
+    </w:p>
+    <w:p>
+      <w:r>
+        <w:t xml:space="preserve">Summarise the main findings and takeaways.</w:t>
+      </w:r>
+    </w:p>
+    <w:p>
+      <w:pPr>
+        <w:pStyle w:val="Heading1"/>
+        <w:keepNext/>
+        <w:keepLines/>
+      </w:pPr>
+      <w:r>
+        <w:t xml:space="preserve">References</w:t>
       </w:r>
     </w:p>
     <w:p>
       <w:r>
         <w:t xml:space="preserve">List the sources, software and other work cited in the report.</w:t>
+      </w:r>
+    </w:p>
+    <w:p>
+      <w:pPr>
+        <w:pStyle w:val="Heading1"/>
+        <w:keepNext/>
+        <w:keepLines/>
+      </w:pPr>
+      <w:r>
+        <w:t xml:space="preserve">Appendix (Optional)</w:t>
+      </w:r>
+    </w:p>
+    <w:p>
+      <w:r>
+        <w:t xml:space="preserve">Include supplementary results or details, if needed; otherwise remove this section.</w:t>
       </w:r>
     </w:p>
     <w:sectPr>
@@ -670,13 +856,39 @@
     <w:basedOn w:val="Normal"/>
     <w:pPr>
       <w:keepNext/>
-      <w:spacing w:before="240" w:after="240" w:line="288" w:lineRule="exact"/>
+      <w:spacing w:before="240" w:after="120" w:line="288" w:lineRule="exact"/>
       <w:outlineLvl w:val="0"/>
     </w:pPr>
     <w:rPr>
       <w:b/>
       <w:sz w:val="24"/>
     </w:rPr>
+  </w:style>
+  <w:style w:type="paragraph" w:styleId="Heading2">
+    <w:name w:val="heading 2"/>
+    <w:basedOn w:val="Normal"/>
+    <w:pPr>
+      <w:keepNext/>
+      <w:spacing w:before="200" w:after="80"/>
+      <w:outlineLvl w:val="1"/>
+    </w:pPr>
+    <w:rPr>
+      <w:b/>
+    </w:rPr>
+  </w:style>
+  <w:style w:type="paragraph" w:styleId="FigurePlaceholder">
+    <w:name w:val="Figure Placeholder"/>
+    <w:basedOn w:val="Normal"/>
+    <w:pPr>
+      <w:jc w:val="center"/>
+    </w:pPr>
+  </w:style>
+  <w:style w:type="paragraph" w:styleId="Caption">
+    <w:name w:val="caption"/>
+    <w:basedOn w:val="Normal"/>
+    <w:pPr>
+      <w:jc w:val="center"/>
+    </w:pPr>
   </w:style>
   <w:style w:type="paragraph" w:styleId="TableText">
     <w:name w:val="Table Text"/>

</xml_diff>

<commit_message>
docs(project): refine references and link presentation videos
</commit_message>
<xml_diff>
--- a/public/group-project/report-template.docx
+++ b/public/group-project/report-template.docx
@@ -20,6 +20,11 @@
     <w:p>
       <w:r>
         <w:t xml:space="preserve">Group ID: [Group ID]</w:t>
+      </w:r>
+    </w:p>
+    <w:p>
+      <w:r>
+        <w:t xml:space="preserve">Presentation video: [YouTube Unlisted URL]</w:t>
       </w:r>
     </w:p>
     <w:p>
@@ -584,6 +589,11 @@
       </w:r>
     </w:p>
     <w:p>
+      <w:r>
+        <w:t xml:space="preserve">Cite sources as [1], [2], etc., numbered in order of first citation. Replace these example citations and reference entries with your own.</w:t>
+      </w:r>
+    </w:p>
+    <w:p>
       <w:pPr>
         <w:pStyle w:val="Heading1"/>
         <w:keepNext/>
@@ -796,6 +806,16 @@
     <w:p>
       <w:r>
         <w:t xml:space="preserve">List the sources, software and other work cited in the report.</w:t>
+      </w:r>
+    </w:p>
+    <w:p>
+      <w:r>
+        <w:t xml:space="preserve">[1] Trevor Hastie, Robert Tibshirani, and Jerome Friedman. The Elements of Statistical Learning: Data Mining, Inference, and Prediction. Springer, 2nd edition, 2009.</w:t>
+      </w:r>
+    </w:p>
+    <w:p>
+      <w:r>
+        <w:t xml:space="preserve">[2] Christopher M. Bishop. Pattern Recognition and Machine Learning. Springer, 2006.</w:t>
       </w:r>
     </w:p>
     <w:p>

</xml_diff>